<commit_message>
Update compiling with vs_2022.docx
Update instructions after removing googletest, boost, and updating cmake to properly copy test_bldg.yaml and test.epw
</commit_message>
<xml_diff>
--- a/IsoModel/compiling with vs_2022.docx
+++ b/IsoModel/compiling with vs_2022.docx
@@ -18,6 +18,61 @@
     </w:p>
     <w:p/>
     <w:p>
+      <w:pPr>
+        <w:rPr>
+          <w:i/>
+          <w:iCs/>
+        </w:rPr>
+      </w:pPr>
+      <w:r>
+        <w:rPr>
+          <w:i/>
+          <w:iCs/>
+        </w:rPr>
+        <w:t xml:space="preserve">As of 15-Dec-2025 Boost dependence has been removed and Google Test is downloaded automagically along with </w:t>
+      </w:r>
+      <w:proofErr w:type="spellStart"/>
+      <w:r>
+        <w:rPr>
+          <w:i/>
+          <w:iCs/>
+        </w:rPr>
+        <w:t>yaml</w:t>
+      </w:r>
+      <w:proofErr w:type="spellEnd"/>
+      <w:r>
+        <w:rPr>
+          <w:i/>
+          <w:iCs/>
+        </w:rPr>
+        <w:t xml:space="preserve"> stuff as part of the compile process.</w:t>
+      </w:r>
+      <w:r>
+        <w:rPr>
+          <w:i/>
+          <w:iCs/>
+        </w:rPr>
+        <w:t xml:space="preserve">  This makes </w:t>
+      </w:r>
+      <w:proofErr w:type="gramStart"/>
+      <w:r>
+        <w:rPr>
+          <w:i/>
+          <w:iCs/>
+        </w:rPr>
+        <w:t>install</w:t>
+      </w:r>
+      <w:proofErr w:type="gramEnd"/>
+      <w:r>
+        <w:rPr>
+          <w:i/>
+          <w:iCs/>
+        </w:rPr>
+        <w:t xml:space="preserve"> and compilation much easier for both Windows and Linux based development.</w:t>
+      </w:r>
+    </w:p>
+    <w:p/>
+    <w:p>
       <w:r>
         <w:t>If you plan to work from the publicly available, open source, ISOmodel git repository and keep your changes/additions open source, the terms of use allow use of VS 2022 community edition even if you are a commercial business or enterprise.  If you are a commercial company and plan on keeping those changes within your company or releasing in closed source software, you cannot use VS 2022 community edition</w:t>
       </w:r>
@@ -28,7 +83,23 @@
     <w:p/>
     <w:p>
       <w:r>
-        <w:t xml:space="preserve">In the setup process it’s best to install CMake first so that the Visual Studio environment can find CMake during its own install. </w:t>
+        <w:t xml:space="preserve">In the setup process it’s best to install </w:t>
+      </w:r>
+      <w:proofErr w:type="spellStart"/>
+      <w:r>
+        <w:t>CMake</w:t>
+      </w:r>
+      <w:proofErr w:type="spellEnd"/>
+      <w:r>
+        <w:t xml:space="preserve"> first so that the Visual Studio environment can find </w:t>
+      </w:r>
+      <w:proofErr w:type="spellStart"/>
+      <w:r>
+        <w:t>CMake</w:t>
+      </w:r>
+      <w:proofErr w:type="spellEnd"/>
+      <w:r>
+        <w:t xml:space="preserve"> during its own install. </w:t>
       </w:r>
     </w:p>
     <w:p/>
@@ -37,10 +108,18 @@
         <w:pStyle w:val="Heading2"/>
       </w:pPr>
       <w:r>
-        <w:t>Install CMake &gt;=3.</w:t>
-      </w:r>
-      <w:r>
-        <w:t>20</w:t>
+        <w:t xml:space="preserve">Install </w:t>
+      </w:r>
+      <w:proofErr w:type="spellStart"/>
+      <w:r>
+        <w:t>CMake</w:t>
+      </w:r>
+      <w:proofErr w:type="spellEnd"/>
+      <w:r>
+        <w:t xml:space="preserve"> &gt;=3.2</w:t>
+      </w:r>
+      <w:r>
+        <w:t>0</w:t>
       </w:r>
     </w:p>
     <w:p>
@@ -54,8 +133,32 @@
       </w:hyperlink>
     </w:p>
     <w:p>
-      <w:r>
-        <w:t>Install with the option “Add CMake to the PATH environment variable” checked.</w:t>
+      <w:hyperlink r:id="rId5" w:history="1">
+        <w:r>
+          <w:rPr>
+            <w:rStyle w:val="Hyperlink"/>
+          </w:rPr>
+          <w:t>https://cmake.org/download/</w:t>
+        </w:r>
+      </w:hyperlink>
+    </w:p>
+    <w:p>
+      <w:r>
+        <w:t>Choose the latest version of CMAKE for windows X64 installer</w:t>
+      </w:r>
+    </w:p>
+    <w:p/>
+    <w:p>
+      <w:r>
+        <w:t xml:space="preserve">Install with the option “Add </w:t>
+      </w:r>
+      <w:proofErr w:type="spellStart"/>
+      <w:r>
+        <w:t>CMake</w:t>
+      </w:r>
+      <w:proofErr w:type="spellEnd"/>
+      <w:r>
+        <w:t xml:space="preserve"> to the PATH environment variable” checked.</w:t>
       </w:r>
     </w:p>
     <w:p>
@@ -114,6 +217,7 @@
         <w:rPr>
           <w:noProof/>
         </w:rPr>
+        <w:lastRenderedPageBreak/>
         <w:drawing>
           <wp:inline distT="0" distB="0" distL="0" distR="0" wp14:anchorId="7BBFB16C" wp14:editId="134AAEC1">
             <wp:extent cx="5041900" cy="3394125"/>
@@ -130,7 +234,7 @@
                     <pic:cNvPicPr/>
                   </pic:nvPicPr>
                   <pic:blipFill>
-                    <a:blip r:embed="rId5"/>
+                    <a:blip r:embed="rId6"/>
                     <a:stretch>
                       <a:fillRect/>
                     </a:stretch>
@@ -159,67 +263,110 @@
         <w:pStyle w:val="Heading2"/>
       </w:pPr>
       <w:r>
-        <w:lastRenderedPageBreak/>
-        <w:t>Creating the</w:t>
-      </w:r>
-      <w:r>
-        <w:t xml:space="preserve"> using Visual Studio IDE</w:t>
-      </w:r>
-      <w:r>
-        <w:t xml:space="preserve"> Project files</w:t>
-      </w:r>
-    </w:p>
-    <w:p/>
-    <w:p>
-      <w:r>
-        <w:t>First we need to create the .sln files</w:t>
-      </w:r>
-    </w:p>
-    <w:p>
-      <w:r>
-        <w:t xml:space="preserve">Open a command line and go to the </w:t>
-      </w:r>
-      <w:r>
-        <w:t xml:space="preserve">isomodel directory </w:t>
-      </w:r>
-      <w:r>
-        <w:t xml:space="preserve">root </w:t>
-      </w:r>
-      <w:r>
-        <w:t xml:space="preserve">(e.g. c:\git\isomodel\isomodel\) </w:t>
-      </w:r>
-      <w:r>
-        <w:t>and m</w:t>
-      </w:r>
-      <w:r>
-        <w:t>ake a binary directory</w:t>
-      </w:r>
-    </w:p>
-    <w:p/>
-    <w:p>
-      <w:pPr>
-        <w:rPr>
-          <w:rFonts w:ascii="Courier New" w:hAnsi="Courier New" w:cs="Courier New"/>
-        </w:rPr>
-      </w:pPr>
-      <w:r>
-        <w:rPr>
-          <w:rFonts w:ascii="Courier New" w:hAnsi="Courier New" w:cs="Courier New"/>
-        </w:rPr>
-        <w:t>cd C:\git\idomodel\isomodel</w:t>
-      </w:r>
-    </w:p>
-    <w:p>
-      <w:pPr>
-        <w:rPr>
-          <w:rFonts w:ascii="Courier New" w:hAnsi="Courier New" w:cs="Courier New"/>
-        </w:rPr>
-      </w:pPr>
-      <w:r>
-        <w:rPr>
-          <w:rFonts w:ascii="Courier New" w:hAnsi="Courier New" w:cs="Courier New"/>
-        </w:rPr>
-        <w:t>mkdir bin</w:t>
+        <w:t>Creating Visual Studio Project Files</w:t>
+      </w:r>
+    </w:p>
+    <w:p>
+      <w:pPr>
+        <w:rPr>
+          <w:rFonts w:ascii="Courier New" w:hAnsi="Courier New" w:cs="Courier New"/>
+        </w:rPr>
+      </w:pPr>
+    </w:p>
+    <w:p>
+      <w:proofErr w:type="gramStart"/>
+      <w:r>
+        <w:t>First</w:t>
+      </w:r>
+      <w:proofErr w:type="gramEnd"/>
+      <w:r>
+        <w:t xml:space="preserve"> we need to create the .</w:t>
+      </w:r>
+      <w:proofErr w:type="spellStart"/>
+      <w:r>
+        <w:t>sln</w:t>
+      </w:r>
+      <w:proofErr w:type="spellEnd"/>
+      <w:r>
+        <w:t xml:space="preserve"> files</w:t>
+      </w:r>
+    </w:p>
+    <w:p/>
+    <w:p>
+      <w:r>
+        <w:t xml:space="preserve">Open a command prompt that has </w:t>
+      </w:r>
+      <w:proofErr w:type="spellStart"/>
+      <w:r>
+        <w:t>cmake</w:t>
+      </w:r>
+      <w:proofErr w:type="spellEnd"/>
+      <w:r>
+        <w:t xml:space="preserve"> in the path.</w:t>
+      </w:r>
+    </w:p>
+    <w:p/>
+    <w:p>
+      <w:r>
+        <w:t xml:space="preserve">Go to </w:t>
+      </w:r>
+      <w:proofErr w:type="spellStart"/>
+      <w:r>
+        <w:t>isomodel</w:t>
+      </w:r>
+      <w:proofErr w:type="spellEnd"/>
+      <w:r>
+        <w:t xml:space="preserve"> directory root (e.g. c:\git\isomodel\isomodel\) and make a </w:t>
+      </w:r>
+      <w:r>
+        <w:t>bin directory for the binaries</w:t>
+      </w:r>
+    </w:p>
+    <w:p/>
+    <w:p>
+      <w:pPr>
+        <w:rPr>
+          <w:rFonts w:ascii="Courier New" w:hAnsi="Courier New" w:cs="Courier New"/>
+        </w:rPr>
+      </w:pPr>
+      <w:r>
+        <w:rPr>
+          <w:rFonts w:ascii="Courier New" w:hAnsi="Courier New" w:cs="Courier New"/>
+        </w:rPr>
+        <w:t>cd C:\git\i</w:t>
+      </w:r>
+      <w:r>
+        <w:rPr>
+          <w:rFonts w:ascii="Courier New" w:hAnsi="Courier New" w:cs="Courier New"/>
+        </w:rPr>
+        <w:t>s</w:t>
+      </w:r>
+      <w:r>
+        <w:rPr>
+          <w:rFonts w:ascii="Courier New" w:hAnsi="Courier New" w:cs="Courier New"/>
+        </w:rPr>
+        <w:t>omodel\isomodel</w:t>
+      </w:r>
+    </w:p>
+    <w:p>
+      <w:pPr>
+        <w:rPr>
+          <w:rFonts w:ascii="Courier New" w:hAnsi="Courier New" w:cs="Courier New"/>
+        </w:rPr>
+      </w:pPr>
+      <w:proofErr w:type="spellStart"/>
+      <w:r>
+        <w:rPr>
+          <w:rFonts w:ascii="Courier New" w:hAnsi="Courier New" w:cs="Courier New"/>
+        </w:rPr>
+        <w:t>mkdir</w:t>
+      </w:r>
+      <w:proofErr w:type="spellEnd"/>
+      <w:r>
+        <w:rPr>
+          <w:rFonts w:ascii="Courier New" w:hAnsi="Courier New" w:cs="Courier New"/>
+        </w:rPr>
+        <w:t xml:space="preserve"> bin</w:t>
       </w:r>
     </w:p>
     <w:p>
@@ -244,43 +391,136 @@
     </w:p>
     <w:p>
       <w:r>
-        <w:t xml:space="preserve">Now you use cmake to create </w:t>
-      </w:r>
-    </w:p>
-    <w:p/>
-    <w:p>
-      <w:pPr>
-        <w:rPr>
-          <w:rFonts w:ascii="Courier New" w:hAnsi="Courier New" w:cs="Courier New"/>
-        </w:rPr>
-      </w:pPr>
-      <w:r>
-        <w:rPr>
-          <w:rFonts w:ascii="Courier New" w:hAnsi="Courier New" w:cs="Courier New"/>
-        </w:rPr>
-        <w:t xml:space="preserve">cmake ../src </w:t>
-      </w:r>
-    </w:p>
-    <w:p>
-      <w:pPr>
-        <w:rPr>
-          <w:rFonts w:ascii="Courier New" w:hAnsi="Courier New" w:cs="Courier New"/>
-        </w:rPr>
-      </w:pPr>
-    </w:p>
-    <w:p>
-      <w:r>
-        <w:t>If things are working the output should look something like this:</w:t>
-      </w:r>
-    </w:p>
-    <w:p/>
+        <w:t xml:space="preserve">Now, if you are lucky, </w:t>
+      </w:r>
+      <w:proofErr w:type="spellStart"/>
+      <w:r>
+        <w:t>cmake</w:t>
+      </w:r>
+      <w:proofErr w:type="spellEnd"/>
+      <w:r>
+        <w:t xml:space="preserve"> will autodetect Visual Studio 22</w:t>
+      </w:r>
+      <w:r>
+        <w:t xml:space="preserve"> and you can create </w:t>
+      </w:r>
+      <w:r>
+        <w:t>the Visual Studio 2022 project files with the command line:</w:t>
+      </w:r>
+    </w:p>
+    <w:p/>
+    <w:p>
+      <w:proofErr w:type="spellStart"/>
+      <w:r>
+        <w:rPr>
+          <w:rFonts w:ascii="Courier New" w:hAnsi="Courier New" w:cs="Courier New"/>
+        </w:rPr>
+        <w:t>cmake</w:t>
+      </w:r>
+      <w:proofErr w:type="spellEnd"/>
+      <w:proofErr w:type="gramStart"/>
+      <w:r>
+        <w:rPr>
+          <w:rFonts w:ascii="Courier New" w:hAnsi="Courier New" w:cs="Courier New"/>
+        </w:rPr>
+        <w:t xml:space="preserve"> ..</w:t>
+      </w:r>
+      <w:proofErr w:type="gramEnd"/>
+      <w:r>
+        <w:rPr>
+          <w:rFonts w:ascii="Courier New" w:hAnsi="Courier New" w:cs="Courier New"/>
+        </w:rPr>
+        <w:t>/</w:t>
+      </w:r>
+      <w:proofErr w:type="spellStart"/>
+      <w:r>
+        <w:rPr>
+          <w:rFonts w:ascii="Courier New" w:hAnsi="Courier New" w:cs="Courier New"/>
+        </w:rPr>
+        <w:t>src</w:t>
+      </w:r>
+      <w:proofErr w:type="spellEnd"/>
+    </w:p>
+    <w:p/>
+    <w:p>
+      <w:r>
+        <w:t>If all goes well things will run, print some output, a couple warnings but then finally end with the following lines</w:t>
+      </w:r>
+      <w:r>
+        <w:t xml:space="preserve"> (times will differ on your machine)</w:t>
+      </w:r>
+    </w:p>
+    <w:p/>
+    <w:p>
+      <w:pPr>
+        <w:ind w:left="720"/>
+        <w:rPr>
+          <w:rFonts w:ascii="Courier New" w:hAnsi="Courier New" w:cs="Courier New"/>
+        </w:rPr>
+      </w:pPr>
+      <w:r>
+        <w:rPr>
+          <w:rFonts w:ascii="Courier New" w:hAnsi="Courier New" w:cs="Courier New"/>
+        </w:rPr>
+        <w:t>-- Configuring done (73.1s)</w:t>
+      </w:r>
+    </w:p>
+    <w:p>
+      <w:pPr>
+        <w:ind w:left="720"/>
+        <w:rPr>
+          <w:rFonts w:ascii="Courier New" w:hAnsi="Courier New" w:cs="Courier New"/>
+        </w:rPr>
+      </w:pPr>
+      <w:r>
+        <w:rPr>
+          <w:rFonts w:ascii="Courier New" w:hAnsi="Courier New" w:cs="Courier New"/>
+        </w:rPr>
+        <w:t>-- Generating done (1.1s)</w:t>
+      </w:r>
+    </w:p>
+    <w:p>
+      <w:pPr>
+        <w:ind w:left="720"/>
+        <w:rPr>
+          <w:rFonts w:ascii="Courier New" w:hAnsi="Courier New" w:cs="Courier New"/>
+        </w:rPr>
+      </w:pPr>
+      <w:r>
+        <w:rPr>
+          <w:rFonts w:ascii="Courier New" w:hAnsi="Courier New" w:cs="Courier New"/>
+        </w:rPr>
+        <w:t>-- Build files have been written to: C:/Git/ISOmodel/IsoModel/bin</w:t>
+      </w:r>
+    </w:p>
+    <w:p>
+      <w:pPr>
+        <w:ind w:left="720"/>
+        <w:rPr>
+          <w:rFonts w:ascii="Courier New" w:hAnsi="Courier New" w:cs="Courier New"/>
+        </w:rPr>
+      </w:pPr>
+    </w:p>
+    <w:p>
+      <w:pPr>
+        <w:rPr>
+          <w:rFonts w:cstheme="minorHAnsi"/>
+        </w:rPr>
+      </w:pPr>
+      <w:r>
+        <w:rPr>
+          <w:rFonts w:cstheme="minorHAnsi"/>
+        </w:rPr>
+        <w:t>Here is the full output on my computer</w:t>
+      </w:r>
+    </w:p>
     <w:p>
       <w:r>
         <w:drawing>
-          <wp:inline distT="0" distB="0" distL="0" distR="0" wp14:anchorId="7958D4E7" wp14:editId="6E324158">
-            <wp:extent cx="5943600" cy="3623945"/>
+          <wp:inline distT="0" distB="0" distL="0" distR="0" wp14:anchorId="1EA5FC35" wp14:editId="6F1648F1">
+            <wp:extent cx="5943600" cy="3126105"/>
             <wp:effectExtent l="0" t="0" r="0" b="0"/>
-            <wp:docPr id="704013084" name="Picture 1" descr="Text&#10;&#10;AI-generated content may be incorrect."/>
+            <wp:docPr id="536899943" name="Picture 1" descr="Text&#10;&#10;AI-generated content may be incorrect."/>
             <wp:cNvGraphicFramePr>
               <a:graphicFrameLocks xmlns:a="http://schemas.openxmlformats.org/drawingml/2006/main" noChangeAspect="1"/>
             </wp:cNvGraphicFramePr>
@@ -288,72 +528,7 @@
               <a:graphicData uri="http://schemas.openxmlformats.org/drawingml/2006/picture">
                 <pic:pic xmlns:pic="http://schemas.openxmlformats.org/drawingml/2006/picture">
                   <pic:nvPicPr>
-                    <pic:cNvPr id="704013084" name="Picture 1" descr="Text&#10;&#10;AI-generated content may be incorrect."/>
-                    <pic:cNvPicPr/>
-                  </pic:nvPicPr>
-                  <pic:blipFill>
-                    <a:blip r:embed="rId6"/>
-                    <a:stretch>
-                      <a:fillRect/>
-                    </a:stretch>
-                  </pic:blipFill>
-                  <pic:spPr>
-                    <a:xfrm>
-                      <a:off x="0" y="0"/>
-                      <a:ext cx="5943600" cy="3623945"/>
-                    </a:xfrm>
-                    <a:prstGeom prst="rect">
-                      <a:avLst/>
-                    </a:prstGeom>
-                  </pic:spPr>
-                </pic:pic>
-              </a:graphicData>
-            </a:graphic>
-          </wp:inline>
-        </w:drawing>
-      </w:r>
-    </w:p>
-    <w:p/>
-    <w:p/>
-    <w:p>
-      <w:r>
-        <w:t>This process will have created a CMakeFiles directory and a bunch of other visual studio project files in the bin directory including “</w:t>
-      </w:r>
-      <w:r>
-        <w:rPr>
-          <w:rFonts w:ascii="Courier New" w:hAnsi="Courier New" w:cs="Courier New"/>
-        </w:rPr>
-        <w:t>isomodel_project.sln</w:t>
-      </w:r>
-      <w:r>
-        <w:t>”</w:t>
-      </w:r>
-      <w:r>
-        <w:rPr>
-          <w:rFonts w:ascii="Courier New" w:hAnsi="Courier New" w:cs="Courier New"/>
-        </w:rPr>
-        <w:t xml:space="preserve">.  </w:t>
-      </w:r>
-      <w:r>
-        <w:t>My directory looks like the following</w:t>
-      </w:r>
-    </w:p>
-    <w:p/>
-    <w:p>
-      <w:r>
-        <w:drawing>
-          <wp:inline distT="0" distB="0" distL="0" distR="0" wp14:anchorId="4B1A1E21" wp14:editId="6DA57D15">
-            <wp:extent cx="5943600" cy="4652645"/>
-            <wp:effectExtent l="0" t="0" r="0" b="0"/>
-            <wp:docPr id="2028526966" name="Picture 1" descr="Text&#10;&#10;AI-generated content may be incorrect."/>
-            <wp:cNvGraphicFramePr>
-              <a:graphicFrameLocks xmlns:a="http://schemas.openxmlformats.org/drawingml/2006/main" noChangeAspect="1"/>
-            </wp:cNvGraphicFramePr>
-            <a:graphic xmlns:a="http://schemas.openxmlformats.org/drawingml/2006/main">
-              <a:graphicData uri="http://schemas.openxmlformats.org/drawingml/2006/picture">
-                <pic:pic xmlns:pic="http://schemas.openxmlformats.org/drawingml/2006/picture">
-                  <pic:nvPicPr>
-                    <pic:cNvPr id="2028526966" name="Picture 1" descr="Text&#10;&#10;AI-generated content may be incorrect."/>
+                    <pic:cNvPr id="536899943" name="Picture 1" descr="Text&#10;&#10;AI-generated content may be incorrect."/>
                     <pic:cNvPicPr/>
                   </pic:nvPicPr>
                   <pic:blipFill>
@@ -365,7 +540,7 @@
                   <pic:spPr>
                     <a:xfrm>
                       <a:off x="0" y="0"/>
-                      <a:ext cx="5943600" cy="4652645"/>
+                      <a:ext cx="5943600" cy="3126105"/>
                     </a:xfrm>
                     <a:prstGeom prst="rect">
                       <a:avLst/>
@@ -379,14 +554,223 @@
       </w:r>
     </w:p>
     <w:p/>
-    <w:p>
-      <w:pPr>
-        <w:rPr>
-          <w:rFonts w:cstheme="minorHAnsi"/>
-        </w:rPr>
-      </w:pPr>
-      <w:r>
-        <w:t xml:space="preserve">Load </w:t>
+    <w:p/>
+    <w:p>
+      <w:r>
+        <w:t xml:space="preserve">If </w:t>
+      </w:r>
+      <w:proofErr w:type="spellStart"/>
+      <w:r>
+        <w:t>cmake</w:t>
+      </w:r>
+      <w:proofErr w:type="spellEnd"/>
+      <w:r>
+        <w:t xml:space="preserve"> terminates in an error </w:t>
+      </w:r>
+      <w:proofErr w:type="spellStart"/>
+      <w:r>
+        <w:t>cmake</w:t>
+      </w:r>
+      <w:proofErr w:type="spellEnd"/>
+      <w:r>
+        <w:t xml:space="preserve"> might </w:t>
+      </w:r>
+      <w:r>
+        <w:t xml:space="preserve">not </w:t>
+      </w:r>
+      <w:proofErr w:type="gramStart"/>
+      <w:r>
+        <w:t>finding</w:t>
+      </w:r>
+      <w:proofErr w:type="gramEnd"/>
+      <w:r>
+        <w:t xml:space="preserve"> the Visual Studio compiler</w:t>
+      </w:r>
+      <w:r>
+        <w:t xml:space="preserve"> properly.</w:t>
+      </w:r>
+    </w:p>
+    <w:p/>
+    <w:p>
+      <w:r>
+        <w:t>If you don’t see something like the following line</w:t>
+      </w:r>
+      <w:r>
+        <w:t xml:space="preserve"> at the top</w:t>
+      </w:r>
+      <w:r>
+        <w:t>, then the Visual Studio compiler was not found</w:t>
+      </w:r>
+      <w:r>
+        <w:t xml:space="preserve"> (</w:t>
+      </w:r>
+      <w:proofErr w:type="gramStart"/>
+      <w:r>
+        <w:t>exact #’</w:t>
+      </w:r>
+      <w:proofErr w:type="gramEnd"/>
+      <w:r>
+        <w:t>s will change as VS 2022 has updates)</w:t>
+      </w:r>
+    </w:p>
+    <w:p>
+      <w:pPr>
+        <w:ind w:firstLine="720"/>
+        <w:rPr>
+          <w:rFonts w:ascii="Courier New" w:hAnsi="Courier New" w:cs="Courier New"/>
+        </w:rPr>
+      </w:pPr>
+      <w:r>
+        <w:rPr>
+          <w:rFonts w:ascii="Courier New" w:hAnsi="Courier New" w:cs="Courier New"/>
+        </w:rPr>
+        <w:t>-- Building for: Visual Studio 17 2022</w:t>
+      </w:r>
+    </w:p>
+    <w:p>
+      <w:r>
+        <w:t>And then farther down</w:t>
+      </w:r>
+    </w:p>
+    <w:p>
+      <w:pPr>
+        <w:ind w:left="720"/>
+        <w:rPr>
+          <w:rFonts w:ascii="Courier New" w:hAnsi="Courier New" w:cs="Courier New"/>
+        </w:rPr>
+      </w:pPr>
+      <w:r>
+        <w:rPr>
+          <w:rFonts w:ascii="Courier New" w:hAnsi="Courier New" w:cs="Courier New"/>
+        </w:rPr>
+        <w:t>-- The C compiler identification is MSVC 19.44.35217.0</w:t>
+      </w:r>
+    </w:p>
+    <w:p>
+      <w:pPr>
+        <w:ind w:left="720"/>
+        <w:rPr>
+          <w:rFonts w:ascii="Courier New" w:hAnsi="Courier New" w:cs="Courier New"/>
+        </w:rPr>
+      </w:pPr>
+      <w:r>
+        <w:rPr>
+          <w:rFonts w:ascii="Courier New" w:hAnsi="Courier New" w:cs="Courier New"/>
+        </w:rPr>
+        <w:t>-- The CXX compiler identification is MSVC 19.44.35217.0</w:t>
+      </w:r>
+    </w:p>
+    <w:p/>
+    <w:p>
+      <w:r>
+        <w:t xml:space="preserve">To try to fix this problem you can tell </w:t>
+      </w:r>
+      <w:proofErr w:type="spellStart"/>
+      <w:r>
+        <w:t>cmake</w:t>
+      </w:r>
+      <w:proofErr w:type="spellEnd"/>
+      <w:r>
+        <w:t xml:space="preserve"> explicitly the version by specifically adding info on the command line with </w:t>
+      </w:r>
+      <w:proofErr w:type="spellStart"/>
+      <w:r>
+        <w:t>cmake</w:t>
+      </w:r>
+      <w:proofErr w:type="spellEnd"/>
+      <w:r>
+        <w:t xml:space="preserve">.  </w:t>
+      </w:r>
+    </w:p>
+    <w:p/>
+    <w:p>
+      <w:r>
+        <w:t>Try:</w:t>
+      </w:r>
+    </w:p>
+    <w:p/>
+    <w:p>
+      <w:pPr>
+        <w:rPr>
+          <w:rFonts w:ascii="Courier New" w:hAnsi="Courier New" w:cs="Courier New"/>
+        </w:rPr>
+      </w:pPr>
+      <w:proofErr w:type="spellStart"/>
+      <w:r>
+        <w:rPr>
+          <w:rFonts w:ascii="Courier New" w:hAnsi="Courier New" w:cs="Courier New"/>
+        </w:rPr>
+        <w:t>cmake</w:t>
+      </w:r>
+      <w:proofErr w:type="spellEnd"/>
+      <w:proofErr w:type="gramStart"/>
+      <w:r>
+        <w:rPr>
+          <w:rFonts w:ascii="Courier New" w:hAnsi="Courier New" w:cs="Courier New"/>
+        </w:rPr>
+        <w:t xml:space="preserve"> ..</w:t>
+      </w:r>
+      <w:proofErr w:type="gramEnd"/>
+      <w:r>
+        <w:rPr>
+          <w:rFonts w:ascii="Courier New" w:hAnsi="Courier New" w:cs="Courier New"/>
+        </w:rPr>
+        <w:t>/</w:t>
+      </w:r>
+      <w:proofErr w:type="spellStart"/>
+      <w:r>
+        <w:rPr>
+          <w:rFonts w:ascii="Courier New" w:hAnsi="Courier New" w:cs="Courier New"/>
+        </w:rPr>
+        <w:t>src</w:t>
+      </w:r>
+      <w:proofErr w:type="spellEnd"/>
+      <w:r>
+        <w:rPr>
+          <w:rFonts w:ascii="Courier New" w:hAnsi="Courier New" w:cs="Courier New"/>
+        </w:rPr>
+        <w:t xml:space="preserve"> -G</w:t>
+      </w:r>
+      <w:r>
+        <w:rPr>
+          <w:rFonts w:ascii="Courier New" w:hAnsi="Courier New" w:cs="Courier New"/>
+        </w:rPr>
+        <w:t xml:space="preserve"> "Visual Studio 17 2022" </w:t>
+      </w:r>
+    </w:p>
+    <w:p>
+      <w:pPr>
+        <w:rPr>
+          <w:rFonts w:ascii="Courier New" w:hAnsi="Courier New" w:cs="Courier New"/>
+        </w:rPr>
+      </w:pPr>
+    </w:p>
+    <w:p>
+      <w:pPr>
+        <w:rPr>
+          <w:rFonts w:ascii="Courier New" w:hAnsi="Courier New" w:cs="Courier New"/>
+        </w:rPr>
+      </w:pPr>
+    </w:p>
+    <w:p>
+      <w:r>
+        <w:t xml:space="preserve">A completed </w:t>
+      </w:r>
+      <w:proofErr w:type="spellStart"/>
+      <w:r>
+        <w:t>cmake</w:t>
+      </w:r>
+      <w:proofErr w:type="spellEnd"/>
+      <w:r>
+        <w:t xml:space="preserve"> process will have created a </w:t>
+      </w:r>
+      <w:proofErr w:type="spellStart"/>
+      <w:r>
+        <w:t>CMakeFiles</w:t>
+      </w:r>
+      <w:proofErr w:type="spellEnd"/>
+      <w:r>
+        <w:t xml:space="preserve"> directory and a bunch of other visual studio project files in the bin directory including “</w:t>
       </w:r>
       <w:r>
         <w:rPr>
@@ -395,65 +779,28 @@
         <w:t>isomodel_project.sln</w:t>
       </w:r>
       <w:r>
-        <w:rPr>
-          <w:rFonts w:ascii="Courier New" w:hAnsi="Courier New" w:cs="Courier New"/>
-        </w:rPr>
-        <w:t xml:space="preserve"> </w:t>
-      </w:r>
-      <w:r>
-        <w:rPr>
-          <w:rFonts w:cstheme="minorHAnsi"/>
-        </w:rPr>
-        <w:t>into Visual Studio</w:t>
-      </w:r>
-      <w:r>
-        <w:rPr>
-          <w:rFonts w:cstheme="minorHAnsi"/>
-        </w:rPr>
-        <w:t xml:space="preserve"> and ch</w:t>
-      </w:r>
-      <w:r>
-        <w:rPr>
-          <w:rFonts w:cstheme="minorHAnsi"/>
-        </w:rPr>
-        <w:t>ange build to Release, x64</w:t>
-      </w:r>
-      <w:r>
-        <w:rPr>
-          <w:rFonts w:cstheme="minorHAnsi"/>
-        </w:rPr>
-        <w:t xml:space="preserve"> and build the entire project</w:t>
-      </w:r>
-      <w:r>
-        <w:rPr>
-          <w:rFonts w:cstheme="minorHAnsi"/>
-        </w:rPr>
-        <w:t>.  You can do that by double clicking isomodel_project.sln from windows explorer.</w:t>
-      </w:r>
-    </w:p>
-    <w:p>
-      <w:pPr>
-        <w:rPr>
-          <w:rFonts w:cstheme="minorHAnsi"/>
-        </w:rPr>
-      </w:pPr>
-    </w:p>
-    <w:p>
-      <w:pPr>
-        <w:rPr>
-          <w:rFonts w:cstheme="minorHAnsi"/>
-        </w:rPr>
-      </w:pPr>
-      <w:r>
-        <w:rPr>
-          <w:rFonts w:cstheme="minorHAnsi"/>
+        <w:t>”</w:t>
+      </w:r>
+      <w:r>
+        <w:rPr>
+          <w:rFonts w:ascii="Courier New" w:hAnsi="Courier New" w:cs="Courier New"/>
+        </w:rPr>
+        <w:t xml:space="preserve">.  </w:t>
+      </w:r>
+      <w:r>
+        <w:t>My directory looks like the following</w:t>
+      </w:r>
+    </w:p>
+    <w:p>
+      <w:r>
+        <w:rPr>
           <w:noProof/>
         </w:rPr>
         <w:drawing>
-          <wp:inline distT="0" distB="0" distL="0" distR="0" wp14:anchorId="00859F46" wp14:editId="1145BCC6">
-            <wp:extent cx="5601482" cy="790685"/>
-            <wp:effectExtent l="0" t="0" r="0" b="9525"/>
-            <wp:docPr id="628466624" name="Picture 1" descr="Graphical user interface, application&#10;&#10;AI-generated content may be incorrect."/>
+          <wp:inline distT="0" distB="0" distL="0" distR="0" wp14:anchorId="73DB9239" wp14:editId="5EF38C0B">
+            <wp:extent cx="4482282" cy="3587262"/>
+            <wp:effectExtent l="0" t="0" r="0" b="0"/>
+            <wp:docPr id="1536230573" name="Picture 1" descr="Text&#10;&#10;AI-generated content may be incorrect."/>
             <wp:cNvGraphicFramePr>
               <a:graphicFrameLocks xmlns:a="http://schemas.openxmlformats.org/drawingml/2006/main" noChangeAspect="1"/>
             </wp:cNvGraphicFramePr>
@@ -461,7 +808,7 @@
               <a:graphicData uri="http://schemas.openxmlformats.org/drawingml/2006/picture">
                 <pic:pic xmlns:pic="http://schemas.openxmlformats.org/drawingml/2006/picture">
                   <pic:nvPicPr>
-                    <pic:cNvPr id="628466624" name="Picture 1" descr="Graphical user interface, application&#10;&#10;AI-generated content may be incorrect."/>
+                    <pic:cNvPr id="1536230573" name="Picture 1" descr="Text&#10;&#10;AI-generated content may be incorrect."/>
                     <pic:cNvPicPr/>
                   </pic:nvPicPr>
                   <pic:blipFill>
@@ -473,7 +820,7 @@
                   <pic:spPr>
                     <a:xfrm>
                       <a:off x="0" y="0"/>
-                      <a:ext cx="5601482" cy="790685"/>
+                      <a:ext cx="4488654" cy="3592361"/>
                     </a:xfrm>
                     <a:prstGeom prst="rect">
                       <a:avLst/>
@@ -487,17 +834,129 @@
       </w:r>
     </w:p>
     <w:p/>
-    <w:p/>
-    <w:p>
-      <w:r>
-        <w:rPr>
+    <w:p>
+      <w:pPr>
+        <w:spacing w:after="160"/>
+        <w:rPr>
+          <w:rFonts w:eastAsiaTheme="majorEastAsia" w:cstheme="minorHAnsi"/>
+          <w:b/>
+          <w:sz w:val="24"/>
+          <w:szCs w:val="24"/>
+        </w:rPr>
+      </w:pPr>
+    </w:p>
+    <w:p>
+      <w:pPr>
+        <w:spacing w:after="160"/>
+        <w:rPr>
+          <w:rFonts w:eastAsiaTheme="majorEastAsia" w:cstheme="minorHAnsi"/>
+          <w:b/>
+          <w:sz w:val="24"/>
+          <w:szCs w:val="24"/>
+        </w:rPr>
+      </w:pPr>
+      <w:r>
+        <w:br w:type="page"/>
+      </w:r>
+    </w:p>
+    <w:p>
+      <w:pPr>
+        <w:pStyle w:val="Heading2"/>
+      </w:pPr>
+      <w:r>
+        <w:t xml:space="preserve">Compiling </w:t>
+      </w:r>
+      <w:proofErr w:type="spellStart"/>
+      <w:r>
+        <w:t>isomodel</w:t>
+      </w:r>
+      <w:proofErr w:type="spellEnd"/>
+      <w:r>
+        <w:t xml:space="preserve"> using </w:t>
+      </w:r>
+      <w:r>
+        <w:t>Visual</w:t>
+      </w:r>
+      <w:r>
+        <w:t xml:space="preserve"> Studio IDE</w:t>
+      </w:r>
+    </w:p>
+    <w:p>
+      <w:pPr>
+        <w:rPr>
+          <w:rFonts w:ascii="Courier New" w:hAnsi="Courier New" w:cs="Courier New"/>
+        </w:rPr>
+      </w:pPr>
+    </w:p>
+    <w:p>
+      <w:pPr>
+        <w:rPr>
+          <w:rFonts w:cstheme="minorHAnsi"/>
+        </w:rPr>
+      </w:pPr>
+      <w:r>
+        <w:t xml:space="preserve">Load </w:t>
+      </w:r>
+      <w:r>
+        <w:rPr>
+          <w:rFonts w:ascii="Courier New" w:hAnsi="Courier New" w:cs="Courier New"/>
+        </w:rPr>
+        <w:t>isomodel_project.sln</w:t>
+      </w:r>
+      <w:r>
+        <w:rPr>
+          <w:rFonts w:ascii="Courier New" w:hAnsi="Courier New" w:cs="Courier New"/>
+        </w:rPr>
+        <w:t xml:space="preserve"> </w:t>
+      </w:r>
+      <w:r>
+        <w:rPr>
+          <w:rFonts w:cstheme="minorHAnsi"/>
+        </w:rPr>
+        <w:t>into Visual Studio</w:t>
+      </w:r>
+      <w:r>
+        <w:rPr>
+          <w:rFonts w:cstheme="minorHAnsi"/>
+        </w:rPr>
+        <w:t xml:space="preserve"> and ch</w:t>
+      </w:r>
+      <w:r>
+        <w:rPr>
+          <w:rFonts w:cstheme="minorHAnsi"/>
+        </w:rPr>
+        <w:t>ange build to Release, x64</w:t>
+      </w:r>
+      <w:r>
+        <w:rPr>
+          <w:rFonts w:cstheme="minorHAnsi"/>
+        </w:rPr>
+        <w:t xml:space="preserve"> and build the entire project</w:t>
+      </w:r>
+    </w:p>
+    <w:p>
+      <w:pPr>
+        <w:rPr>
+          <w:rFonts w:cstheme="minorHAnsi"/>
+        </w:rPr>
+      </w:pPr>
+    </w:p>
+    <w:p>
+      <w:pPr>
+        <w:rPr>
+          <w:rFonts w:cstheme="minorHAnsi"/>
+        </w:rPr>
+      </w:pPr>
+      <w:r>
+        <w:rPr>
+          <w:rFonts w:cstheme="minorHAnsi"/>
           <w:noProof/>
         </w:rPr>
         <w:drawing>
-          <wp:inline distT="0" distB="0" distL="0" distR="0" wp14:anchorId="534FFD3D" wp14:editId="6F4968B2">
-            <wp:extent cx="3277057" cy="1867161"/>
+          <wp:inline distT="0" distB="0" distL="0" distR="0" wp14:anchorId="5A561A1B" wp14:editId="34346450">
+            <wp:extent cx="5010849" cy="438211"/>
             <wp:effectExtent l="0" t="0" r="0" b="0"/>
-            <wp:docPr id="1363849551" name="Picture 1" descr="Graphical user interface, text, application&#10;&#10;AI-generated content may be incorrect."/>
+            <wp:docPr id="1870916679" name="Picture 1"/>
             <wp:cNvGraphicFramePr>
               <a:graphicFrameLocks xmlns:a="http://schemas.openxmlformats.org/drawingml/2006/main" noChangeAspect="1"/>
             </wp:cNvGraphicFramePr>
@@ -505,7 +964,7 @@
               <a:graphicData uri="http://schemas.openxmlformats.org/drawingml/2006/picture">
                 <pic:pic xmlns:pic="http://schemas.openxmlformats.org/drawingml/2006/picture">
                   <pic:nvPicPr>
-                    <pic:cNvPr id="1363849551" name="Picture 1" descr="Graphical user interface, text, application&#10;&#10;AI-generated content may be incorrect."/>
+                    <pic:cNvPr id="1870916679" name=""/>
                     <pic:cNvPicPr/>
                   </pic:nvPicPr>
                   <pic:blipFill>
@@ -517,7 +976,7 @@
                   <pic:spPr>
                     <a:xfrm>
                       <a:off x="0" y="0"/>
-                      <a:ext cx="3277057" cy="1867161"/>
+                      <a:ext cx="5010849" cy="438211"/>
                     </a:xfrm>
                     <a:prstGeom prst="rect">
                       <a:avLst/>
@@ -530,39 +989,29 @@
         </w:drawing>
       </w:r>
     </w:p>
-    <w:p/>
-    <w:p/>
-    <w:p>
-      <w:r>
-        <w:t xml:space="preserve">This will crunch for a while </w:t>
-      </w:r>
-      <w:r>
-        <w:t xml:space="preserve">, </w:t>
-      </w:r>
-      <w:r>
-        <w:t xml:space="preserve">give you </w:t>
-      </w:r>
-      <w:r>
-        <w:t xml:space="preserve">some </w:t>
-      </w:r>
-      <w:r>
-        <w:t>warnings</w:t>
-      </w:r>
-      <w:r>
-        <w:t xml:space="preserve">, and then complete.  This full build will build some yaml tools and the google test library before the actual isomodel projects so it can take a while.  You can speed up future compilation for individual projects by selecting the “Project Only” build options when you right click.  Anyhow, </w:t>
-      </w:r>
-      <w:r>
-        <w:t xml:space="preserve"> and some errors, but hopefully you will get through it and the bottom of the output should look something like this:</w:t>
-      </w:r>
-    </w:p>
-    <w:p/>
-    <w:p>
-      <w:r>
+    <w:p>
+      <w:pPr>
+        <w:rPr>
+          <w:rFonts w:cstheme="minorHAnsi"/>
+        </w:rPr>
+      </w:pPr>
+    </w:p>
+    <w:p>
+      <w:pPr>
+        <w:rPr>
+          <w:rFonts w:cstheme="minorHAnsi"/>
+        </w:rPr>
+      </w:pPr>
+      <w:r>
+        <w:rPr>
+          <w:rFonts w:cstheme="minorHAnsi"/>
+          <w:noProof/>
+        </w:rPr>
         <w:drawing>
-          <wp:inline distT="0" distB="0" distL="0" distR="0" wp14:anchorId="51227772" wp14:editId="2A4E7235">
-            <wp:extent cx="5943600" cy="1983105"/>
-            <wp:effectExtent l="0" t="0" r="0" b="0"/>
-            <wp:docPr id="1278714501" name="Picture 1" descr="Graphical user interface, text, application&#10;&#10;AI-generated content may be incorrect."/>
+          <wp:inline distT="0" distB="0" distL="0" distR="0" wp14:anchorId="0BC35EF7" wp14:editId="78836723">
+            <wp:extent cx="3096057" cy="1905266"/>
+            <wp:effectExtent l="0" t="0" r="9525" b="0"/>
+            <wp:docPr id="289929647" name="Picture 1" descr="Graphical user interface, text, application, email&#10;&#10;AI-generated content may be incorrect."/>
             <wp:cNvGraphicFramePr>
               <a:graphicFrameLocks xmlns:a="http://schemas.openxmlformats.org/drawingml/2006/main" noChangeAspect="1"/>
             </wp:cNvGraphicFramePr>
@@ -570,7 +1019,7 @@
               <a:graphicData uri="http://schemas.openxmlformats.org/drawingml/2006/picture">
                 <pic:pic xmlns:pic="http://schemas.openxmlformats.org/drawingml/2006/picture">
                   <pic:nvPicPr>
-                    <pic:cNvPr id="1278714501" name="Picture 1" descr="Graphical user interface, text, application&#10;&#10;AI-generated content may be incorrect."/>
+                    <pic:cNvPr id="289929647" name="Picture 1" descr="Graphical user interface, text, application, email&#10;&#10;AI-generated content may be incorrect."/>
                     <pic:cNvPicPr/>
                   </pic:nvPicPr>
                   <pic:blipFill>
@@ -582,7 +1031,7 @@
                   <pic:spPr>
                     <a:xfrm>
                       <a:off x="0" y="0"/>
-                      <a:ext cx="5943600" cy="1983105"/>
+                      <a:ext cx="3096057" cy="1905266"/>
                     </a:xfrm>
                     <a:prstGeom prst="rect">
                       <a:avLst/>
@@ -598,93 +1047,79 @@
     <w:p/>
     <w:p>
       <w:r>
-        <w:t>The compiled programs will be in the bin\Release subdirectory</w:t>
-      </w:r>
-    </w:p>
-    <w:p/>
-    <w:p>
-      <w:pPr>
-        <w:spacing w:after="160"/>
-        <w:rPr>
-          <w:rFonts w:eastAsiaTheme="majorEastAsia" w:cstheme="minorHAnsi"/>
-          <w:b/>
-          <w:sz w:val="24"/>
-          <w:szCs w:val="24"/>
-        </w:rPr>
-      </w:pPr>
-      <w:r>
-        <w:br w:type="page"/>
-      </w:r>
-    </w:p>
-    <w:p>
-      <w:pPr>
-        <w:pStyle w:val="Heading2"/>
-      </w:pPr>
-      <w:r>
-        <w:t xml:space="preserve">Testing the Build.  </w:t>
-      </w:r>
-    </w:p>
-    <w:p>
-      <w:r>
-        <w:t xml:space="preserve">If the isomodel_unit_tests build </w:t>
-      </w:r>
-      <w:r>
-        <w:t>succeeded,</w:t>
-      </w:r>
-      <w:r>
-        <w:t xml:space="preserve"> you should be able to </w:t>
-      </w:r>
-      <w:r>
-        <w:t>run the unit tests and confirm your compile worked right</w:t>
-      </w:r>
-    </w:p>
-    <w:p/>
-    <w:p>
-      <w:pPr>
-        <w:rPr>
-          <w:rFonts w:ascii="Courier New" w:hAnsi="Courier New" w:cs="Courier New"/>
-        </w:rPr>
-      </w:pPr>
-      <w:r>
-        <w:rPr>
-          <w:rFonts w:ascii="Courier New" w:hAnsi="Courier New" w:cs="Courier New"/>
-        </w:rPr>
-        <w:t>cd Release</w:t>
-      </w:r>
-    </w:p>
-    <w:p>
-      <w:pPr>
-        <w:rPr>
-          <w:rFonts w:ascii="Courier New" w:hAnsi="Courier New" w:cs="Courier New"/>
-        </w:rPr>
-      </w:pPr>
-      <w:r>
-        <w:rPr>
-          <w:rFonts w:ascii="Courier New" w:hAnsi="Courier New" w:cs="Courier New"/>
-        </w:rPr>
-        <w:t>isomodel_unit_tests.exe</w:t>
-      </w:r>
-    </w:p>
-    <w:p>
-      <w:pPr>
-        <w:rPr>
-          <w:rFonts w:ascii="Courier New" w:hAnsi="Courier New" w:cs="Courier New"/>
-        </w:rPr>
-      </w:pPr>
-    </w:p>
-    <w:p>
-      <w:r>
-        <w:t>When I run the output looks like this:</w:t>
-      </w:r>
-    </w:p>
-    <w:p/>
-    <w:p>
-      <w:r>
+        <w:t xml:space="preserve">This will </w:t>
+      </w:r>
+      <w:r>
+        <w:t xml:space="preserve">compile </w:t>
+      </w:r>
+      <w:proofErr w:type="spellStart"/>
+      <w:r>
+        <w:t>yaml-cpp</w:t>
+      </w:r>
+      <w:proofErr w:type="spellEnd"/>
+      <w:r>
+        <w:t xml:space="preserve">, </w:t>
+      </w:r>
+      <w:proofErr w:type="spellStart"/>
+      <w:r>
+        <w:t>googletest</w:t>
+      </w:r>
+      <w:proofErr w:type="spellEnd"/>
+      <w:r>
+        <w:t xml:space="preserve">, and the ISOmodel.  You should get no warnings/errors when </w:t>
+      </w:r>
+      <w:r>
+        <w:t xml:space="preserve">Visual Studio is </w:t>
+      </w:r>
+      <w:proofErr w:type="gramStart"/>
+      <w:r>
+        <w:t xml:space="preserve">compiling  </w:t>
+      </w:r>
+      <w:proofErr w:type="spellStart"/>
+      <w:r>
+        <w:t>yaml</w:t>
+      </w:r>
+      <w:proofErr w:type="gramEnd"/>
+      <w:r>
+        <w:t>-cpp</w:t>
+      </w:r>
+      <w:proofErr w:type="spellEnd"/>
+      <w:r>
+        <w:t xml:space="preserve"> and </w:t>
+      </w:r>
+      <w:proofErr w:type="spellStart"/>
+      <w:proofErr w:type="gramStart"/>
+      <w:r>
+        <w:t>googletest</w:t>
+      </w:r>
+      <w:proofErr w:type="spellEnd"/>
+      <w:r>
+        <w:t>, but</w:t>
+      </w:r>
+      <w:proofErr w:type="gramEnd"/>
+      <w:r>
+        <w:t xml:space="preserve"> will get many warnings when compiling the ISOmodel itself.  Hopefully the compiling will occur without error and </w:t>
+      </w:r>
+      <w:proofErr w:type="spellStart"/>
+      <w:r>
+        <w:t>youll</w:t>
+      </w:r>
+      <w:proofErr w:type="spellEnd"/>
+      <w:r>
+        <w:t xml:space="preserve"> eventually get output like this:</w:t>
+      </w:r>
+    </w:p>
+    <w:p/>
+    <w:p>
+      <w:r>
+        <w:rPr>
+          <w:noProof/>
+        </w:rPr>
         <w:drawing>
-          <wp:inline distT="0" distB="0" distL="0" distR="0" wp14:anchorId="227F1B15" wp14:editId="2B4A013A">
-            <wp:extent cx="4772025" cy="4097518"/>
-            <wp:effectExtent l="0" t="0" r="0" b="0"/>
-            <wp:docPr id="1100732762" name="Picture 1" descr="Text&#10;&#10;AI-generated content may be incorrect."/>
+          <wp:inline distT="0" distB="0" distL="0" distR="0" wp14:anchorId="0E273290" wp14:editId="5C1BD348">
+            <wp:extent cx="5943600" cy="1687830"/>
+            <wp:effectExtent l="0" t="0" r="0" b="7620"/>
+            <wp:docPr id="1871706142" name="Picture 1" descr="Text, letter&#10;&#10;AI-generated content may be incorrect."/>
             <wp:cNvGraphicFramePr>
               <a:graphicFrameLocks xmlns:a="http://schemas.openxmlformats.org/drawingml/2006/main" noChangeAspect="1"/>
             </wp:cNvGraphicFramePr>
@@ -692,7 +1127,7 @@
               <a:graphicData uri="http://schemas.openxmlformats.org/drawingml/2006/picture">
                 <pic:pic xmlns:pic="http://schemas.openxmlformats.org/drawingml/2006/picture">
                   <pic:nvPicPr>
-                    <pic:cNvPr id="1100732762" name="Picture 1" descr="Text&#10;&#10;AI-generated content may be incorrect."/>
+                    <pic:cNvPr id="1871706142" name="Picture 1" descr="Text, letter&#10;&#10;AI-generated content may be incorrect."/>
                     <pic:cNvPicPr/>
                   </pic:nvPicPr>
                   <pic:blipFill>
@@ -704,7 +1139,7 @@
                   <pic:spPr>
                     <a:xfrm>
                       <a:off x="0" y="0"/>
-                      <a:ext cx="4773674" cy="4098934"/>
+                      <a:ext cx="5943600" cy="1687830"/>
                     </a:xfrm>
                     <a:prstGeom prst="rect">
                       <a:avLst/>
@@ -719,74 +1154,98 @@
     </w:p>
     <w:p/>
     <w:p>
-      <w:r>
-        <w:t>You should also test the isomodel_standalone.  To do that you will need to get a building yaml file and weather file.  You can copy test_bldg.yaml and test.epw  files to the release directory with the command and run the isomodel standalone with the commands</w:t>
-      </w:r>
-    </w:p>
-    <w:p/>
-    <w:p>
-      <w:pPr>
-        <w:rPr>
-          <w:rFonts w:ascii="Courier New" w:hAnsi="Courier New" w:cs="Courier New"/>
-        </w:rPr>
-      </w:pPr>
-      <w:r>
-        <w:rPr>
-          <w:rFonts w:ascii="Courier New" w:hAnsi="Courier New" w:cs="Courier New"/>
-        </w:rPr>
-        <w:t>cp ..\..\test_data\</w:t>
-      </w:r>
-      <w:r>
-        <w:rPr>
-          <w:rFonts w:ascii="Courier New" w:hAnsi="Courier New" w:cs="Courier New"/>
-        </w:rPr>
-        <w:t>test*</w:t>
-      </w:r>
-      <w:r>
-        <w:rPr>
-          <w:rFonts w:ascii="Courier New" w:hAnsi="Courier New" w:cs="Courier New"/>
-        </w:rPr>
-        <w:t xml:space="preserve">  </w:t>
-      </w:r>
-      <w:r>
-        <w:rPr>
-          <w:rFonts w:ascii="Courier New" w:hAnsi="Courier New" w:cs="Courier New"/>
-        </w:rPr>
-        <w:t>.</w:t>
-      </w:r>
-    </w:p>
-    <w:p>
-      <w:pPr>
-        <w:rPr>
-          <w:rFonts w:ascii="Courier New" w:hAnsi="Courier New" w:cs="Courier New"/>
-        </w:rPr>
-      </w:pPr>
-      <w:r>
-        <w:rPr>
-          <w:rFonts w:ascii="Courier New" w:hAnsi="Courier New" w:cs="Courier New"/>
-        </w:rPr>
-        <w:t xml:space="preserve">isomodel_standalone.exe -h -i </w:t>
-      </w:r>
-      <w:r>
-        <w:rPr>
-          <w:rFonts w:ascii="Courier New" w:hAnsi="Courier New" w:cs="Courier New"/>
-        </w:rPr>
-        <w:t>test_bldg.yaml</w:t>
-      </w:r>
-    </w:p>
-    <w:p/>
-    <w:p>
-      <w:r>
-        <w:t>You should get something like the following out</w:t>
-      </w:r>
-    </w:p>
+      <w:pPr>
+        <w:spacing w:after="160"/>
+        <w:rPr>
+          <w:rFonts w:eastAsiaTheme="majorEastAsia" w:cstheme="minorHAnsi"/>
+          <w:b/>
+          <w:sz w:val="24"/>
+          <w:szCs w:val="24"/>
+        </w:rPr>
+      </w:pPr>
+      <w:r>
+        <w:br w:type="page"/>
+      </w:r>
+    </w:p>
+    <w:p>
+      <w:pPr>
+        <w:pStyle w:val="Heading2"/>
+      </w:pPr>
+      <w:r>
+        <w:t xml:space="preserve">Testing the Build.  </w:t>
+      </w:r>
+    </w:p>
+    <w:p/>
+    <w:p>
+      <w:r>
+        <w:t xml:space="preserve">You can most easily test the build by running the </w:t>
+      </w:r>
+      <w:proofErr w:type="spellStart"/>
+      <w:r>
+        <w:t>isomodel</w:t>
+      </w:r>
+      <w:proofErr w:type="spellEnd"/>
+      <w:r>
+        <w:t xml:space="preserve"> unit tests.</w:t>
+      </w:r>
+    </w:p>
+    <w:p>
+      <w:r>
+        <w:t xml:space="preserve">Go into the Release directory and run </w:t>
+      </w:r>
+      <w:proofErr w:type="spellStart"/>
+      <w:r>
+        <w:t>isomodel_unit_tests</w:t>
+      </w:r>
+      <w:proofErr w:type="spellEnd"/>
+    </w:p>
+    <w:p/>
+    <w:p>
+      <w:pPr>
+        <w:rPr>
+          <w:rFonts w:ascii="Courier New" w:hAnsi="Courier New" w:cs="Courier New"/>
+        </w:rPr>
+      </w:pPr>
+      <w:r>
+        <w:rPr>
+          <w:rFonts w:ascii="Courier New" w:hAnsi="Courier New" w:cs="Courier New"/>
+        </w:rPr>
+        <w:t>cd Release</w:t>
+      </w:r>
+    </w:p>
+    <w:p>
+      <w:pPr>
+        <w:rPr>
+          <w:rFonts w:ascii="Courier New" w:hAnsi="Courier New" w:cs="Courier New"/>
+        </w:rPr>
+      </w:pPr>
+      <w:r>
+        <w:rPr>
+          <w:rFonts w:ascii="Courier New" w:hAnsi="Courier New" w:cs="Courier New"/>
+        </w:rPr>
+        <w:t>isomodel_unit_tests.exe</w:t>
+      </w:r>
+    </w:p>
+    <w:p>
+      <w:pPr>
+        <w:rPr>
+          <w:rFonts w:ascii="Courier New" w:hAnsi="Courier New" w:cs="Courier New"/>
+        </w:rPr>
+      </w:pPr>
+    </w:p>
+    <w:p>
+      <w:r>
+        <w:t>The output should look something like this:</w:t>
+      </w:r>
+    </w:p>
+    <w:p/>
     <w:p>
       <w:r>
         <w:drawing>
-          <wp:inline distT="0" distB="0" distL="0" distR="0" wp14:anchorId="222FA9DB" wp14:editId="0116EF8E">
-            <wp:extent cx="5943600" cy="2071370"/>
-            <wp:effectExtent l="0" t="0" r="0" b="5080"/>
-            <wp:docPr id="1093800067" name="Picture 1" descr="Text&#10;&#10;AI-generated content may be incorrect."/>
+          <wp:inline distT="0" distB="0" distL="0" distR="0" wp14:anchorId="3662E77D" wp14:editId="396E18E3">
+            <wp:extent cx="5943600" cy="3602355"/>
+            <wp:effectExtent l="0" t="0" r="0" b="0"/>
+            <wp:docPr id="648555021" name="Picture 1" descr="Text&#10;&#10;AI-generated content may be incorrect."/>
             <wp:cNvGraphicFramePr>
               <a:graphicFrameLocks xmlns:a="http://schemas.openxmlformats.org/drawingml/2006/main" noChangeAspect="1"/>
             </wp:cNvGraphicFramePr>
@@ -794,7 +1253,7 @@
               <a:graphicData uri="http://schemas.openxmlformats.org/drawingml/2006/picture">
                 <pic:pic xmlns:pic="http://schemas.openxmlformats.org/drawingml/2006/picture">
                   <pic:nvPicPr>
-                    <pic:cNvPr id="1093800067" name="Picture 1" descr="Text&#10;&#10;AI-generated content may be incorrect."/>
+                    <pic:cNvPr id="648555021" name="Picture 1" descr="Text&#10;&#10;AI-generated content may be incorrect."/>
                     <pic:cNvPicPr/>
                   </pic:nvPicPr>
                   <pic:blipFill>
@@ -806,7 +1265,7 @@
                   <pic:spPr>
                     <a:xfrm>
                       <a:off x="0" y="0"/>
-                      <a:ext cx="5943600" cy="2071370"/>
+                      <a:ext cx="5943600" cy="3602355"/>
                     </a:xfrm>
                     <a:prstGeom prst="rect">
                       <a:avLst/>
@@ -820,12 +1279,262 @@
       </w:r>
     </w:p>
     <w:p/>
-    <w:p/>
-    <w:p>
-      <w:r>
-        <w:t>That’s it!  Good job!</w:t>
-      </w:r>
-    </w:p>
+    <w:p>
+      <w:r>
+        <w:t xml:space="preserve">You could also run the </w:t>
+      </w:r>
+      <w:proofErr w:type="spellStart"/>
+      <w:r>
+        <w:t>isomodel_benchmark</w:t>
+      </w:r>
+      <w:proofErr w:type="spellEnd"/>
+      <w:r>
+        <w:t xml:space="preserve"> that is in the release directory:</w:t>
+      </w:r>
+    </w:p>
+    <w:p/>
+    <w:p>
+      <w:pPr>
+        <w:rPr>
+          <w:rFonts w:ascii="Courier New" w:hAnsi="Courier New" w:cs="Courier New"/>
+        </w:rPr>
+      </w:pPr>
+      <w:r>
+        <w:rPr>
+          <w:rFonts w:ascii="Courier New" w:hAnsi="Courier New" w:cs="Courier New"/>
+        </w:rPr>
+        <w:t>cd Release</w:t>
+      </w:r>
+    </w:p>
+    <w:p>
+      <w:pPr>
+        <w:rPr>
+          <w:rFonts w:ascii="Courier New" w:hAnsi="Courier New" w:cs="Courier New"/>
+        </w:rPr>
+      </w:pPr>
+      <w:proofErr w:type="gramStart"/>
+      <w:r>
+        <w:rPr>
+          <w:rFonts w:ascii="Courier New" w:hAnsi="Courier New" w:cs="Courier New"/>
+        </w:rPr>
+        <w:t>isomodel_</w:t>
+      </w:r>
+      <w:r>
+        <w:rPr>
+          <w:rFonts w:ascii="Courier New" w:hAnsi="Courier New" w:cs="Courier New"/>
+        </w:rPr>
+        <w:t>benchmark.exe .</w:t>
+      </w:r>
+      <w:proofErr w:type="gramEnd"/>
+    </w:p>
+    <w:p>
+      <w:pPr>
+        <w:rPr>
+          <w:rFonts w:ascii="Courier New" w:hAnsi="Courier New" w:cs="Courier New"/>
+        </w:rPr>
+      </w:pPr>
+    </w:p>
+    <w:p>
+      <w:r>
+        <w:t>You should get something like this:</w:t>
+      </w:r>
+    </w:p>
+    <w:p>
+      <w:r>
+        <w:drawing>
+          <wp:inline distT="0" distB="0" distL="0" distR="0" wp14:anchorId="3B1EAE9F" wp14:editId="1D7E7C9F">
+            <wp:extent cx="5943600" cy="1028065"/>
+            <wp:effectExtent l="0" t="0" r="0" b="635"/>
+            <wp:docPr id="1454761059" name="Picture 1" descr="Text&#10;&#10;AI-generated content may be incorrect."/>
+            <wp:cNvGraphicFramePr>
+              <a:graphicFrameLocks xmlns:a="http://schemas.openxmlformats.org/drawingml/2006/main" noChangeAspect="1"/>
+            </wp:cNvGraphicFramePr>
+            <a:graphic xmlns:a="http://schemas.openxmlformats.org/drawingml/2006/main">
+              <a:graphicData uri="http://schemas.openxmlformats.org/drawingml/2006/picture">
+                <pic:pic xmlns:pic="http://schemas.openxmlformats.org/drawingml/2006/picture">
+                  <pic:nvPicPr>
+                    <pic:cNvPr id="1454761059" name="Picture 1" descr="Text&#10;&#10;AI-generated content may be incorrect."/>
+                    <pic:cNvPicPr/>
+                  </pic:nvPicPr>
+                  <pic:blipFill>
+                    <a:blip r:embed="rId13"/>
+                    <a:stretch>
+                      <a:fillRect/>
+                    </a:stretch>
+                  </pic:blipFill>
+                  <pic:spPr>
+                    <a:xfrm>
+                      <a:off x="0" y="0"/>
+                      <a:ext cx="5943600" cy="1028065"/>
+                    </a:xfrm>
+                    <a:prstGeom prst="rect">
+                      <a:avLst/>
+                    </a:prstGeom>
+                  </pic:spPr>
+                </pic:pic>
+              </a:graphicData>
+            </a:graphic>
+          </wp:inline>
+        </w:drawing>
+      </w:r>
+    </w:p>
+    <w:p/>
+    <w:p>
+      <w:proofErr w:type="gramStart"/>
+      <w:r>
+        <w:t>Finally,  you</w:t>
+      </w:r>
+      <w:proofErr w:type="gramEnd"/>
+      <w:r>
+        <w:t xml:space="preserve"> can </w:t>
+      </w:r>
+      <w:proofErr w:type="gramStart"/>
+      <w:r>
+        <w:t>also  run</w:t>
+      </w:r>
+      <w:proofErr w:type="gramEnd"/>
+      <w:r>
+        <w:t xml:space="preserve"> the </w:t>
+      </w:r>
+      <w:proofErr w:type="spellStart"/>
+      <w:r>
+        <w:t>isomodel</w:t>
+      </w:r>
+      <w:proofErr w:type="spellEnd"/>
+      <w:r>
+        <w:t xml:space="preserve"> standalone </w:t>
+      </w:r>
+    </w:p>
+    <w:p>
+      <w:pPr>
+        <w:rPr>
+          <w:rFonts w:ascii="Courier New" w:hAnsi="Courier New" w:cs="Courier New"/>
+        </w:rPr>
+      </w:pPr>
+      <w:r>
+        <w:rPr>
+          <w:rFonts w:ascii="Courier New" w:hAnsi="Courier New" w:cs="Courier New"/>
+        </w:rPr>
+        <w:t>cd Release</w:t>
+      </w:r>
+    </w:p>
+    <w:p>
+      <w:pPr>
+        <w:rPr>
+          <w:rFonts w:ascii="Courier New" w:hAnsi="Courier New" w:cs="Courier New"/>
+        </w:rPr>
+      </w:pPr>
+      <w:r>
+        <w:rPr>
+          <w:rFonts w:ascii="Courier New" w:hAnsi="Courier New" w:cs="Courier New"/>
+        </w:rPr>
+        <w:t xml:space="preserve">isomodel_standalone.exe -h </w:t>
+      </w:r>
+      <w:proofErr w:type="spellStart"/>
+      <w:r>
+        <w:rPr>
+          <w:rFonts w:ascii="Courier New" w:hAnsi="Courier New" w:cs="Courier New"/>
+        </w:rPr>
+        <w:t>test_</w:t>
+      </w:r>
+      <w:proofErr w:type="gramStart"/>
+      <w:r>
+        <w:rPr>
+          <w:rFonts w:ascii="Courier New" w:hAnsi="Courier New" w:cs="Courier New"/>
+        </w:rPr>
+        <w:t>bldg.yaml</w:t>
+      </w:r>
+      <w:proofErr w:type="spellEnd"/>
+      <w:proofErr w:type="gramEnd"/>
+    </w:p>
+    <w:p>
+      <w:pPr>
+        <w:rPr>
+          <w:rFonts w:ascii="Courier New" w:hAnsi="Courier New" w:cs="Courier New"/>
+        </w:rPr>
+      </w:pPr>
+    </w:p>
+    <w:p>
+      <w:r>
+        <w:t>The output should look something like this:</w:t>
+      </w:r>
+    </w:p>
+    <w:p/>
+    <w:p>
+      <w:pPr>
+        <w:rPr>
+          <w:rFonts w:ascii="Courier New" w:hAnsi="Courier New" w:cs="Courier New"/>
+        </w:rPr>
+      </w:pPr>
+      <w:r>
+        <w:rPr>
+          <w:rFonts w:ascii="Courier New" w:hAnsi="Courier New" w:cs="Courier New"/>
+        </w:rPr>
+        <w:drawing>
+          <wp:inline distT="0" distB="0" distL="0" distR="0" wp14:anchorId="6730906C" wp14:editId="7275B949">
+            <wp:extent cx="5943600" cy="1670050"/>
+            <wp:effectExtent l="0" t="0" r="0" b="6350"/>
+            <wp:docPr id="413774488" name="Picture 1" descr="Text&#10;&#10;AI-generated content may be incorrect."/>
+            <wp:cNvGraphicFramePr>
+              <a:graphicFrameLocks xmlns:a="http://schemas.openxmlformats.org/drawingml/2006/main" noChangeAspect="1"/>
+            </wp:cNvGraphicFramePr>
+            <a:graphic xmlns:a="http://schemas.openxmlformats.org/drawingml/2006/main">
+              <a:graphicData uri="http://schemas.openxmlformats.org/drawingml/2006/picture">
+                <pic:pic xmlns:pic="http://schemas.openxmlformats.org/drawingml/2006/picture">
+                  <pic:nvPicPr>
+                    <pic:cNvPr id="413774488" name="Picture 1" descr="Text&#10;&#10;AI-generated content may be incorrect."/>
+                    <pic:cNvPicPr/>
+                  </pic:nvPicPr>
+                  <pic:blipFill>
+                    <a:blip r:embed="rId14"/>
+                    <a:stretch>
+                      <a:fillRect/>
+                    </a:stretch>
+                  </pic:blipFill>
+                  <pic:spPr>
+                    <a:xfrm>
+                      <a:off x="0" y="0"/>
+                      <a:ext cx="5943600" cy="1670050"/>
+                    </a:xfrm>
+                    <a:prstGeom prst="rect">
+                      <a:avLst/>
+                    </a:prstGeom>
+                  </pic:spPr>
+                </pic:pic>
+              </a:graphicData>
+            </a:graphic>
+          </wp:inline>
+        </w:drawing>
+      </w:r>
+    </w:p>
+    <w:p/>
+    <w:p>
+      <w:r>
+        <w:t>You</w:t>
+      </w:r>
+      <w:r>
+        <w:t xml:space="preserve"> can run in other modes using -m, or -H.  </w:t>
+      </w:r>
+      <w:r>
+        <w:t xml:space="preserve">-m is monthly </w:t>
+      </w:r>
+      <w:proofErr w:type="gramStart"/>
+      <w:r>
+        <w:t>mode,  -</w:t>
+      </w:r>
+      <w:proofErr w:type="gramEnd"/>
+      <w:r>
+        <w:t>H is hourly mode with all 8760 hours output</w:t>
+      </w:r>
+    </w:p>
+    <w:p/>
+    <w:p/>
+    <w:p>
+      <w:r>
+        <w:t>Congratulations:  You have compiled the ISOmodel!</w:t>
+      </w:r>
+    </w:p>
+    <w:p/>
     <w:sectPr>
       <w:pgSz w:w="12240" w:h="15840"/>
       <w:pgMar w:top="1440" w:right="1440" w:bottom="1440" w:left="1440" w:header="720" w:footer="720" w:gutter="0"/>
@@ -1234,7 +1943,7 @@
   <w:style w:type="paragraph" w:default="1" w:styleId="Normal">
     <w:name w:val="Normal"/>
     <w:qFormat/>
-    <w:rsid w:val="00885D11"/>
+    <w:rsid w:val="00C91477"/>
     <w:pPr>
       <w:spacing w:after="0"/>
     </w:pPr>
@@ -1370,17 +2079,6 @@
       <w:color w:val="954F72" w:themeColor="followedHyperlink"/>
       <w:u w:val="single"/>
     </w:rPr>
-  </w:style>
-  <w:style w:type="paragraph" w:styleId="ListParagraph">
-    <w:name w:val="List Paragraph"/>
-    <w:basedOn w:val="Normal"/>
-    <w:uiPriority w:val="34"/>
-    <w:qFormat/>
-    <w:rsid w:val="00885D11"/>
-    <w:pPr>
-      <w:ind w:left="720"/>
-      <w:contextualSpacing/>
-    </w:pPr>
   </w:style>
 </w:styles>
 </file>

</xml_diff>